<commit_message>
Update scheduling and resource management UI integration.
Add new task, milestone, dependency, and resource management frontend components, extend API endpoints and domain types, and refresh project prompt documentation.

Co-authored-by: Cursor <cursoragent@cursor.com>
</commit_message>
<xml_diff>
--- a/BRD V1.0.docx
+++ b/BRD V1.0.docx
@@ -5,7 +5,7 @@
     <w:p>
       <w:r>
         <w:pict w14:anchorId="2383C71C">
-          <v:rect id="_x0000_i1188" style="width:0;height:1.5pt" o:hralign="center" o:hrstd="t" o:hr="t" fillcolor="#a0a0a0" stroked="f"/>
+          <v:rect id="_x0000_i1025" style="width:0;height:1.5pt" o:hralign="center" o:hrstd="t" o:hr="t" fillcolor="#a0a0a0" stroked="f"/>
         </w:pict>
       </w:r>
     </w:p>
@@ -227,7 +227,7 @@
     <w:p>
       <w:r>
         <w:pict w14:anchorId="117A409C">
-          <v:rect id="_x0000_i1189" style="width:0;height:1.5pt" o:hralign="center" o:hrstd="t" o:hr="t" fillcolor="#a0a0a0" stroked="f"/>
+          <v:rect id="_x0000_i1026" style="width:0;height:1.5pt" o:hralign="center" o:hrstd="t" o:hr="t" fillcolor="#a0a0a0" stroked="f"/>
         </w:pict>
       </w:r>
     </w:p>
@@ -663,7 +663,7 @@
     <w:p>
       <w:r>
         <w:pict w14:anchorId="1A0D666F">
-          <v:rect id="_x0000_i1190" style="width:0;height:1.5pt" o:hralign="center" o:hrstd="t" o:hr="t" fillcolor="#a0a0a0" stroked="f"/>
+          <v:rect id="_x0000_i1027" style="width:0;height:1.5pt" o:hralign="center" o:hrstd="t" o:hr="t" fillcolor="#a0a0a0" stroked="f"/>
         </w:pict>
       </w:r>
     </w:p>
@@ -820,7 +820,7 @@
     <w:p>
       <w:r>
         <w:pict w14:anchorId="0F1F67ED">
-          <v:rect id="_x0000_i1191" style="width:0;height:1.5pt" o:hralign="center" o:hrstd="t" o:hr="t" fillcolor="#a0a0a0" stroked="f"/>
+          <v:rect id="_x0000_i1028" style="width:0;height:1.5pt" o:hralign="center" o:hrstd="t" o:hr="t" fillcolor="#a0a0a0" stroked="f"/>
         </w:pict>
       </w:r>
     </w:p>
@@ -1256,7 +1256,7 @@
     <w:p>
       <w:r>
         <w:pict w14:anchorId="42E29A08">
-          <v:rect id="_x0000_i1192" style="width:0;height:1.5pt" o:hralign="center" o:hrstd="t" o:hr="t" fillcolor="#a0a0a0" stroked="f"/>
+          <v:rect id="_x0000_i1029" style="width:0;height:1.5pt" o:hralign="center" o:hrstd="t" o:hr="t" fillcolor="#a0a0a0" stroked="f"/>
         </w:pict>
       </w:r>
     </w:p>
@@ -1278,7 +1278,7 @@
     <w:p>
       <w:r>
         <w:pict w14:anchorId="0A3C01D2">
-          <v:rect id="_x0000_i1193" style="width:0;height:1.5pt" o:hralign="center" o:hrstd="t" o:hr="t" fillcolor="#a0a0a0" stroked="f"/>
+          <v:rect id="_x0000_i1030" style="width:0;height:1.5pt" o:hralign="center" o:hrstd="t" o:hr="t" fillcolor="#a0a0a0" stroked="f"/>
         </w:pict>
       </w:r>
     </w:p>
@@ -1484,7 +1484,7 @@
     <w:p>
       <w:r>
         <w:pict w14:anchorId="3B1E91C2">
-          <v:rect id="_x0000_i1194" style="width:0;height:1.5pt" o:hralign="center" o:hrstd="t" o:hr="t" fillcolor="#a0a0a0" stroked="f"/>
+          <v:rect id="_x0000_i1031" style="width:0;height:1.5pt" o:hralign="center" o:hrstd="t" o:hr="t" fillcolor="#a0a0a0" stroked="f"/>
         </w:pict>
       </w:r>
     </w:p>
@@ -1755,7 +1755,7 @@
     <w:p>
       <w:r>
         <w:pict w14:anchorId="1ECA895C">
-          <v:rect id="_x0000_i1195" style="width:0;height:1.5pt" o:hralign="center" o:hrstd="t" o:hr="t" fillcolor="#a0a0a0" stroked="f"/>
+          <v:rect id="_x0000_i1032" style="width:0;height:1.5pt" o:hralign="center" o:hrstd="t" o:hr="t" fillcolor="#a0a0a0" stroked="f"/>
         </w:pict>
       </w:r>
     </w:p>
@@ -1917,7 +1917,7 @@
     <w:p>
       <w:r>
         <w:pict w14:anchorId="5B0445A5">
-          <v:rect id="_x0000_i1196" style="width:0;height:1.5pt" o:hralign="center" o:hrstd="t" o:hr="t" fillcolor="#a0a0a0" stroked="f"/>
+          <v:rect id="_x0000_i1033" style="width:0;height:1.5pt" o:hralign="center" o:hrstd="t" o:hr="t" fillcolor="#a0a0a0" stroked="f"/>
         </w:pict>
       </w:r>
     </w:p>
@@ -2136,7 +2136,7 @@
     <w:p>
       <w:r>
         <w:pict w14:anchorId="4DF09FC2">
-          <v:rect id="_x0000_i1197" style="width:0;height:1.5pt" o:hralign="center" o:hrstd="t" o:hr="t" fillcolor="#a0a0a0" stroked="f"/>
+          <v:rect id="_x0000_i1034" style="width:0;height:1.5pt" o:hralign="center" o:hrstd="t" o:hr="t" fillcolor="#a0a0a0" stroked="f"/>
         </w:pict>
       </w:r>
     </w:p>
@@ -2268,7 +2268,7 @@
     <w:p>
       <w:r>
         <w:pict w14:anchorId="232DC6FF">
-          <v:rect id="_x0000_i1198" style="width:0;height:1.5pt" o:hralign="center" o:hrstd="t" o:hr="t" fillcolor="#a0a0a0" stroked="f"/>
+          <v:rect id="_x0000_i1035" style="width:0;height:1.5pt" o:hralign="center" o:hrstd="t" o:hr="t" fillcolor="#a0a0a0" stroked="f"/>
         </w:pict>
       </w:r>
     </w:p>
@@ -2397,7 +2397,7 @@
     <w:p>
       <w:r>
         <w:pict w14:anchorId="2E37DF3B">
-          <v:rect id="_x0000_i1199" style="width:0;height:1.5pt" o:hralign="center" o:hrstd="t" o:hr="t" fillcolor="#a0a0a0" stroked="f"/>
+          <v:rect id="_x0000_i1036" style="width:0;height:1.5pt" o:hralign="center" o:hrstd="t" o:hr="t" fillcolor="#a0a0a0" stroked="f"/>
         </w:pict>
       </w:r>
     </w:p>
@@ -2624,7 +2624,7 @@
     <w:p>
       <w:r>
         <w:pict w14:anchorId="307BB5EC">
-          <v:rect id="_x0000_i1200" style="width:0;height:1.5pt" o:hralign="center" o:hrstd="t" o:hr="t" fillcolor="#a0a0a0" stroked="f"/>
+          <v:rect id="_x0000_i1037" style="width:0;height:1.5pt" o:hralign="center" o:hrstd="t" o:hr="t" fillcolor="#a0a0a0" stroked="f"/>
         </w:pict>
       </w:r>
     </w:p>
@@ -2887,7 +2887,7 @@
     <w:p>
       <w:r>
         <w:pict w14:anchorId="14FEF042">
-          <v:rect id="_x0000_i1201" style="width:0;height:1.5pt" o:hralign="center" o:hrstd="t" o:hr="t" fillcolor="#a0a0a0" stroked="f"/>
+          <v:rect id="_x0000_i1038" style="width:0;height:1.5pt" o:hralign="center" o:hrstd="t" o:hr="t" fillcolor="#a0a0a0" stroked="f"/>
         </w:pict>
       </w:r>
     </w:p>
@@ -3151,7 +3151,7 @@
     <w:p>
       <w:r>
         <w:pict w14:anchorId="1353DF6F">
-          <v:rect id="_x0000_i1202" style="width:0;height:1.5pt" o:hralign="center" o:hrstd="t" o:hr="t" fillcolor="#a0a0a0" stroked="f"/>
+          <v:rect id="_x0000_i1039" style="width:0;height:1.5pt" o:hralign="center" o:hrstd="t" o:hr="t" fillcolor="#a0a0a0" stroked="f"/>
         </w:pict>
       </w:r>
     </w:p>
@@ -3334,7 +3334,7 @@
     <w:p>
       <w:r>
         <w:pict w14:anchorId="13AF556E">
-          <v:rect id="_x0000_i1203" style="width:0;height:1.5pt" o:hralign="center" o:hrstd="t" o:hr="t" fillcolor="#a0a0a0" stroked="f"/>
+          <v:rect id="_x0000_i1040" style="width:0;height:1.5pt" o:hralign="center" o:hrstd="t" o:hr="t" fillcolor="#a0a0a0" stroked="f"/>
         </w:pict>
       </w:r>
     </w:p>
@@ -3650,7 +3650,7 @@
     <w:p>
       <w:r>
         <w:pict w14:anchorId="486D27F7">
-          <v:rect id="_x0000_i1204" style="width:0;height:1.5pt" o:hralign="center" o:hrstd="t" o:hr="t" fillcolor="#a0a0a0" stroked="f"/>
+          <v:rect id="_x0000_i1041" style="width:0;height:1.5pt" o:hralign="center" o:hrstd="t" o:hr="t" fillcolor="#a0a0a0" stroked="f"/>
         </w:pict>
       </w:r>
     </w:p>
@@ -3882,7 +3882,7 @@
     <w:p>
       <w:r>
         <w:pict w14:anchorId="1EA301C1">
-          <v:rect id="_x0000_i1205" style="width:0;height:1.5pt" o:hralign="center" o:hrstd="t" o:hr="t" fillcolor="#a0a0a0" stroked="f"/>
+          <v:rect id="_x0000_i1042" style="width:0;height:1.5pt" o:hralign="center" o:hrstd="t" o:hr="t" fillcolor="#a0a0a0" stroked="f"/>
         </w:pict>
       </w:r>
     </w:p>
@@ -3973,7 +3973,7 @@
     <w:p>
       <w:r>
         <w:pict w14:anchorId="6E87067A">
-          <v:rect id="_x0000_i1206" style="width:0;height:1.5pt" o:hralign="center" o:hrstd="t" o:hr="t" fillcolor="#a0a0a0" stroked="f"/>
+          <v:rect id="_x0000_i1043" style="width:0;height:1.5pt" o:hralign="center" o:hrstd="t" o:hr="t" fillcolor="#a0a0a0" stroked="f"/>
         </w:pict>
       </w:r>
     </w:p>
@@ -3996,7 +3996,7 @@
       <w:r>
         <w:lastRenderedPageBreak/>
         <w:pict w14:anchorId="4D106D75">
-          <v:rect id="_x0000_i1207" style="width:0;height:1.5pt" o:hralign="center" o:hrstd="t" o:hr="t" fillcolor="#a0a0a0" stroked="f"/>
+          <v:rect id="_x0000_i1044" style="width:0;height:1.5pt" o:hralign="center" o:hrstd="t" o:hr="t" fillcolor="#a0a0a0" stroked="f"/>
         </w:pict>
       </w:r>
     </w:p>
@@ -4263,7 +4263,7 @@
     <w:p>
       <w:r>
         <w:pict w14:anchorId="0A43F427">
-          <v:rect id="_x0000_i1208" style="width:0;height:1.5pt" o:hralign="center" o:hrstd="t" o:hr="t" fillcolor="#a0a0a0" stroked="f"/>
+          <v:rect id="_x0000_i1045" style="width:0;height:1.5pt" o:hralign="center" o:hrstd="t" o:hr="t" fillcolor="#a0a0a0" stroked="f"/>
         </w:pict>
       </w:r>
     </w:p>
@@ -4406,7 +4406,7 @@
     <w:p>
       <w:r>
         <w:pict w14:anchorId="6BFA3D0E">
-          <v:rect id="_x0000_i1209" style="width:0;height:1.5pt" o:hralign="center" o:hrstd="t" o:hr="t" fillcolor="#a0a0a0" stroked="f"/>
+          <v:rect id="_x0000_i1046" style="width:0;height:1.5pt" o:hralign="center" o:hrstd="t" o:hr="t" fillcolor="#a0a0a0" stroked="f"/>
         </w:pict>
       </w:r>
     </w:p>
@@ -4446,7 +4446,7 @@
     <w:p>
       <w:r>
         <w:pict w14:anchorId="7A052776">
-          <v:rect id="_x0000_i1210" style="width:0;height:1.5pt" o:hralign="center" o:hrstd="t" o:hr="t" fillcolor="#a0a0a0" stroked="f"/>
+          <v:rect id="_x0000_i1047" style="width:0;height:1.5pt" o:hralign="center" o:hrstd="t" o:hr="t" fillcolor="#a0a0a0" stroked="f"/>
         </w:pict>
       </w:r>
     </w:p>
@@ -4709,7 +4709,7 @@
     <w:p>
       <w:r>
         <w:pict w14:anchorId="32C7D0EE">
-          <v:rect id="_x0000_i1211" style="width:0;height:1.5pt" o:hralign="center" o:hrstd="t" o:hr="t" fillcolor="#a0a0a0" stroked="f"/>
+          <v:rect id="_x0000_i1048" style="width:0;height:1.5pt" o:hralign="center" o:hrstd="t" o:hr="t" fillcolor="#a0a0a0" stroked="f"/>
         </w:pict>
       </w:r>
     </w:p>
@@ -4797,7 +4797,7 @@
     <w:p>
       <w:r>
         <w:pict w14:anchorId="36A70611">
-          <v:rect id="_x0000_i1212" style="width:0;height:1.5pt" o:hralign="center" o:hrstd="t" o:hr="t" fillcolor="#a0a0a0" stroked="f"/>
+          <v:rect id="_x0000_i1049" style="width:0;height:1.5pt" o:hralign="center" o:hrstd="t" o:hr="t" fillcolor="#a0a0a0" stroked="f"/>
         </w:pict>
       </w:r>
     </w:p>
@@ -4937,7 +4937,7 @@
     <w:p>
       <w:r>
         <w:pict w14:anchorId="40A07837">
-          <v:rect id="_x0000_i1213" style="width:0;height:1.5pt" o:hralign="center" o:hrstd="t" o:hr="t" fillcolor="#a0a0a0" stroked="f"/>
+          <v:rect id="_x0000_i1050" style="width:0;height:1.5pt" o:hralign="center" o:hrstd="t" o:hr="t" fillcolor="#a0a0a0" stroked="f"/>
         </w:pict>
       </w:r>
     </w:p>
@@ -5346,7 +5346,7 @@
     <w:p>
       <w:r>
         <w:pict w14:anchorId="1149D17F">
-          <v:rect id="_x0000_i1362" style="width:0;height:1.5pt" o:hralign="center" o:hrstd="t" o:hr="t" fillcolor="#a0a0a0" stroked="f"/>
+          <v:rect id="_x0000_i1051" style="width:0;height:1.5pt" o:hralign="center" o:hrstd="t" o:hr="t" fillcolor="#a0a0a0" stroked="f"/>
         </w:pict>
       </w:r>
     </w:p>
@@ -5761,7 +5761,7 @@
     <w:p>
       <w:r>
         <w:pict w14:anchorId="57F6A9BC">
-          <v:rect id="_x0000_i1363" style="width:0;height:1.5pt" o:hralign="center" o:hrstd="t" o:hr="t" fillcolor="#a0a0a0" stroked="f"/>
+          <v:rect id="_x0000_i1052" style="width:0;height:1.5pt" o:hralign="center" o:hrstd="t" o:hr="t" fillcolor="#a0a0a0" stroked="f"/>
         </w:pict>
       </w:r>
     </w:p>
@@ -5815,7 +5815,7 @@
     <w:p>
       <w:r>
         <w:pict w14:anchorId="2CDA7EC5">
-          <v:rect id="_x0000_i1364" style="width:0;height:1.5pt" o:hralign="center" o:hrstd="t" o:hr="t" fillcolor="#a0a0a0" stroked="f"/>
+          <v:rect id="_x0000_i1053" style="width:0;height:1.5pt" o:hralign="center" o:hrstd="t" o:hr="t" fillcolor="#a0a0a0" stroked="f"/>
         </w:pict>
       </w:r>
     </w:p>
@@ -5935,7 +5935,7 @@
     <w:p>
       <w:r>
         <w:pict w14:anchorId="553E0D81">
-          <v:rect id="_x0000_i1365" style="width:0;height:1.5pt" o:hralign="center" o:hrstd="t" o:hr="t" fillcolor="#a0a0a0" stroked="f"/>
+          <v:rect id="_x0000_i1054" style="width:0;height:1.5pt" o:hralign="center" o:hrstd="t" o:hr="t" fillcolor="#a0a0a0" stroked="f"/>
         </w:pict>
       </w:r>
     </w:p>
@@ -6064,7 +6064,7 @@
     <w:p>
       <w:r>
         <w:pict w14:anchorId="4898E1B5">
-          <v:rect id="_x0000_i1366" style="width:0;height:1.5pt" o:hralign="center" o:hrstd="t" o:hr="t" fillcolor="#a0a0a0" stroked="f"/>
+          <v:rect id="_x0000_i1055" style="width:0;height:1.5pt" o:hralign="center" o:hrstd="t" o:hr="t" fillcolor="#a0a0a0" stroked="f"/>
         </w:pict>
       </w:r>
     </w:p>
@@ -6187,7 +6187,7 @@
     <w:p>
       <w:r>
         <w:pict w14:anchorId="2C17C069">
-          <v:rect id="_x0000_i1367" style="width:0;height:1.5pt" o:hralign="center" o:hrstd="t" o:hr="t" fillcolor="#a0a0a0" stroked="f"/>
+          <v:rect id="_x0000_i1056" style="width:0;height:1.5pt" o:hralign="center" o:hrstd="t" o:hr="t" fillcolor="#a0a0a0" stroked="f"/>
         </w:pict>
       </w:r>
     </w:p>
@@ -6534,7 +6534,7 @@
     <w:p>
       <w:r>
         <w:pict w14:anchorId="263D45F3">
-          <v:rect id="_x0000_i1368" style="width:0;height:1.5pt" o:hralign="center" o:hrstd="t" o:hr="t" fillcolor="#a0a0a0" stroked="f"/>
+          <v:rect id="_x0000_i1057" style="width:0;height:1.5pt" o:hralign="center" o:hrstd="t" o:hr="t" fillcolor="#a0a0a0" stroked="f"/>
         </w:pict>
       </w:r>
     </w:p>
@@ -6908,7 +6908,7 @@
     <w:p>
       <w:r>
         <w:pict w14:anchorId="17B151E6">
-          <v:rect id="_x0000_i1369" style="width:0;height:1.5pt" o:hralign="center" o:hrstd="t" o:hr="t" fillcolor="#a0a0a0" stroked="f"/>
+          <v:rect id="_x0000_i1058" style="width:0;height:1.5pt" o:hralign="center" o:hrstd="t" o:hr="t" fillcolor="#a0a0a0" stroked="f"/>
         </w:pict>
       </w:r>
     </w:p>
@@ -6979,7 +6979,7 @@
     <w:p>
       <w:r>
         <w:pict w14:anchorId="089F9723">
-          <v:rect id="_x0000_i1370" style="width:0;height:1.5pt" o:hralign="center" o:hrstd="t" o:hr="t" fillcolor="#a0a0a0" stroked="f"/>
+          <v:rect id="_x0000_i1059" style="width:0;height:1.5pt" o:hralign="center" o:hrstd="t" o:hr="t" fillcolor="#a0a0a0" stroked="f"/>
         </w:pict>
       </w:r>
     </w:p>
@@ -7357,7 +7357,7 @@
     <w:p>
       <w:r>
         <w:pict w14:anchorId="6D75BE21">
-          <v:rect id="_x0000_i1371" style="width:0;height:1.5pt" o:hralign="center" o:hrstd="t" o:hr="t" fillcolor="#a0a0a0" stroked="f"/>
+          <v:rect id="_x0000_i1060" style="width:0;height:1.5pt" o:hralign="center" o:hrstd="t" o:hr="t" fillcolor="#a0a0a0" stroked="f"/>
         </w:pict>
       </w:r>
     </w:p>
@@ -7592,7 +7592,7 @@
     <w:p>
       <w:r>
         <w:pict w14:anchorId="590BDC77">
-          <v:rect id="_x0000_i1372" style="width:0;height:1.5pt" o:hralign="center" o:hrstd="t" o:hr="t" fillcolor="#a0a0a0" stroked="f"/>
+          <v:rect id="_x0000_i1061" style="width:0;height:1.5pt" o:hralign="center" o:hrstd="t" o:hr="t" fillcolor="#a0a0a0" stroked="f"/>
         </w:pict>
       </w:r>
     </w:p>
@@ -7907,7 +7907,7 @@
     <w:p>
       <w:r>
         <w:pict w14:anchorId="3715B166">
-          <v:rect id="_x0000_i1373" style="width:0;height:1.5pt" o:hralign="center" o:hrstd="t" o:hr="t" fillcolor="#a0a0a0" stroked="f"/>
+          <v:rect id="_x0000_i1062" style="width:0;height:1.5pt" o:hralign="center" o:hrstd="t" o:hr="t" fillcolor="#a0a0a0" stroked="f"/>
         </w:pict>
       </w:r>
     </w:p>
@@ -7974,7 +7974,7 @@
     <w:p>
       <w:r>
         <w:pict w14:anchorId="56436CAC">
-          <v:rect id="_x0000_i1374" style="width:0;height:1.5pt" o:hralign="center" o:hrstd="t" o:hr="t" fillcolor="#a0a0a0" stroked="f"/>
+          <v:rect id="_x0000_i1063" style="width:0;height:1.5pt" o:hralign="center" o:hrstd="t" o:hr="t" fillcolor="#a0a0a0" stroked="f"/>
         </w:pict>
       </w:r>
     </w:p>
@@ -8059,7 +8059,7 @@
     <w:p>
       <w:r>
         <w:pict w14:anchorId="73ACDB6C">
-          <v:rect id="_x0000_i1375" style="width:0;height:1.5pt" o:hralign="center" o:hrstd="t" o:hr="t" fillcolor="#a0a0a0" stroked="f"/>
+          <v:rect id="_x0000_i1064" style="width:0;height:1.5pt" o:hralign="center" o:hrstd="t" o:hr="t" fillcolor="#a0a0a0" stroked="f"/>
         </w:pict>
       </w:r>
     </w:p>
@@ -8128,7 +8128,7 @@
     <w:p>
       <w:r>
         <w:pict w14:anchorId="496AAF60">
-          <v:rect id="_x0000_i1376" style="width:0;height:1.5pt" o:hralign="center" o:hrstd="t" o:hr="t" fillcolor="#a0a0a0" stroked="f"/>
+          <v:rect id="_x0000_i1065" style="width:0;height:1.5pt" o:hralign="center" o:hrstd="t" o:hr="t" fillcolor="#a0a0a0" stroked="f"/>
         </w:pict>
       </w:r>
     </w:p>
@@ -8332,7 +8332,7 @@
     <w:p>
       <w:r>
         <w:pict w14:anchorId="1CD6DA82">
-          <v:rect id="_x0000_i1377" style="width:0;height:1.5pt" o:hralign="center" o:hrstd="t" o:hr="t" fillcolor="#a0a0a0" stroked="f"/>
+          <v:rect id="_x0000_i1066" style="width:0;height:1.5pt" o:hralign="center" o:hrstd="t" o:hr="t" fillcolor="#a0a0a0" stroked="f"/>
         </w:pict>
       </w:r>
     </w:p>
@@ -8424,7 +8424,7 @@
     <w:p>
       <w:r>
         <w:pict w14:anchorId="79895E87">
-          <v:rect id="_x0000_i1378" style="width:0;height:1.5pt" o:hralign="center" o:hrstd="t" o:hr="t" fillcolor="#a0a0a0" stroked="f"/>
+          <v:rect id="_x0000_i1067" style="width:0;height:1.5pt" o:hralign="center" o:hrstd="t" o:hr="t" fillcolor="#a0a0a0" stroked="f"/>
         </w:pict>
       </w:r>
     </w:p>
@@ -8691,7 +8691,7 @@
     <w:p>
       <w:r>
         <w:pict w14:anchorId="25FC4ED1">
-          <v:rect id="_x0000_i1379" style="width:0;height:1.5pt" o:hralign="center" o:hrstd="t" o:hr="t" fillcolor="#a0a0a0" stroked="f"/>
+          <v:rect id="_x0000_i1068" style="width:0;height:1.5pt" o:hralign="center" o:hrstd="t" o:hr="t" fillcolor="#a0a0a0" stroked="f"/>
         </w:pict>
       </w:r>
     </w:p>
@@ -8790,7 +8790,7 @@
     <w:p>
       <w:r>
         <w:pict w14:anchorId="5B685F72">
-          <v:rect id="_x0000_i1380" style="width:0;height:1.5pt" o:hralign="center" o:hrstd="t" o:hr="t" fillcolor="#a0a0a0" stroked="f"/>
+          <v:rect id="_x0000_i1069" style="width:0;height:1.5pt" o:hralign="center" o:hrstd="t" o:hr="t" fillcolor="#a0a0a0" stroked="f"/>
         </w:pict>
       </w:r>
     </w:p>
@@ -9018,7 +9018,7 @@
     <w:p>
       <w:r>
         <w:pict w14:anchorId="4E22891B">
-          <v:rect id="_x0000_i1381" style="width:0;height:1.5pt" o:hralign="center" o:hrstd="t" o:hr="t" fillcolor="#a0a0a0" stroked="f"/>
+          <v:rect id="_x0000_i1070" style="width:0;height:1.5pt" o:hralign="center" o:hrstd="t" o:hr="t" fillcolor="#a0a0a0" stroked="f"/>
         </w:pict>
       </w:r>
     </w:p>
@@ -9439,7 +9439,7 @@
           <w:highlight w:val="yellow"/>
         </w:rPr>
         <w:pict w14:anchorId="6FDD29CA">
-          <v:rect id="_x0000_i1510" style="width:0;height:1.5pt" o:hralign="center" o:hrstd="t" o:hr="t" fillcolor="#a0a0a0" stroked="f"/>
+          <v:rect id="_x0000_i1071" style="width:0;height:1.5pt" o:hralign="center" o:hrstd="t" o:hr="t" fillcolor="#a0a0a0" stroked="f"/>
         </w:pict>
       </w:r>
     </w:p>
@@ -9587,7 +9587,7 @@
     <w:p>
       <w:r>
         <w:pict w14:anchorId="12992172">
-          <v:rect id="_x0000_i1511" style="width:0;height:1.5pt" o:hralign="center" o:hrstd="t" o:hr="t" fillcolor="#a0a0a0" stroked="f"/>
+          <v:rect id="_x0000_i1072" style="width:0;height:1.5pt" o:hralign="center" o:hrstd="t" o:hr="t" fillcolor="#a0a0a0" stroked="f"/>
         </w:pict>
       </w:r>
     </w:p>
@@ -9819,7 +9819,7 @@
     <w:p>
       <w:r>
         <w:pict w14:anchorId="17A4DE05">
-          <v:rect id="_x0000_i1512" style="width:0;height:1.5pt" o:hralign="center" o:hrstd="t" o:hr="t" fillcolor="#a0a0a0" stroked="f"/>
+          <v:rect id="_x0000_i1073" style="width:0;height:1.5pt" o:hralign="center" o:hrstd="t" o:hr="t" fillcolor="#a0a0a0" stroked="f"/>
         </w:pict>
       </w:r>
     </w:p>
@@ -9998,7 +9998,7 @@
     <w:p>
       <w:r>
         <w:pict w14:anchorId="2AE623DC">
-          <v:rect id="_x0000_i1513" style="width:0;height:1.5pt" o:hralign="center" o:hrstd="t" o:hr="t" fillcolor="#a0a0a0" stroked="f"/>
+          <v:rect id="_x0000_i1074" style="width:0;height:1.5pt" o:hralign="center" o:hrstd="t" o:hr="t" fillcolor="#a0a0a0" stroked="f"/>
         </w:pict>
       </w:r>
     </w:p>
@@ -10180,7 +10180,7 @@
     <w:p>
       <w:r>
         <w:pict w14:anchorId="59FA71AF">
-          <v:rect id="_x0000_i1514" style="width:0;height:1.5pt" o:hralign="center" o:hrstd="t" o:hr="t" fillcolor="#a0a0a0" stroked="f"/>
+          <v:rect id="_x0000_i1075" style="width:0;height:1.5pt" o:hralign="center" o:hrstd="t" o:hr="t" fillcolor="#a0a0a0" stroked="f"/>
         </w:pict>
       </w:r>
     </w:p>
@@ -10323,7 +10323,7 @@
     <w:p>
       <w:r>
         <w:pict w14:anchorId="77E81A57">
-          <v:rect id="_x0000_i1515" style="width:0;height:1.5pt" o:hralign="center" o:hrstd="t" o:hr="t" fillcolor="#a0a0a0" stroked="f"/>
+          <v:rect id="_x0000_i1076" style="width:0;height:1.5pt" o:hralign="center" o:hrstd="t" o:hr="t" fillcolor="#a0a0a0" stroked="f"/>
         </w:pict>
       </w:r>
     </w:p>
@@ -10626,7 +10626,7 @@
       </w:r>
       <w:r>
         <w:pict w14:anchorId="1E477EA8">
-          <v:rect id="_x0000_i1516" style="width:0;height:1.5pt" o:hralign="center" o:hrstd="t" o:hr="t" fillcolor="#a0a0a0" stroked="f"/>
+          <v:rect id="_x0000_i1077" style="width:0;height:1.5pt" o:hralign="center" o:hrstd="t" o:hr="t" fillcolor="#a0a0a0" stroked="f"/>
         </w:pict>
       </w:r>
     </w:p>
@@ -10876,7 +10876,6 @@
     <w:p>
       <w:pPr>
         <w:rPr>
-          <w:rFonts w:hint="cs"/>
           <w:rtl/>
           <w:lang w:bidi="ar-QA"/>
         </w:rPr>
@@ -10891,7 +10890,7 @@
     <w:p>
       <w:r>
         <w:pict w14:anchorId="37D2C108">
-          <v:rect id="_x0000_i1517" style="width:0;height:1.5pt" o:hralign="center" o:hrstd="t" o:hr="t" fillcolor="#a0a0a0" stroked="f"/>
+          <v:rect id="_x0000_i1078" style="width:0;height:1.5pt" o:hralign="center" o:hrstd="t" o:hr="t" fillcolor="#a0a0a0" stroked="f"/>
         </w:pict>
       </w:r>
     </w:p>
@@ -11120,7 +11119,7 @@
     <w:p>
       <w:r>
         <w:pict w14:anchorId="2B442D1E">
-          <v:rect id="_x0000_i1518" style="width:0;height:1.5pt" o:hralign="center" o:hrstd="t" o:hr="t" fillcolor="#a0a0a0" stroked="f"/>
+          <v:rect id="_x0000_i1079" style="width:0;height:1.5pt" o:hralign="center" o:hrstd="t" o:hr="t" fillcolor="#a0a0a0" stroked="f"/>
         </w:pict>
       </w:r>
     </w:p>
@@ -11484,7 +11483,7 @@
     <w:p>
       <w:r>
         <w:pict w14:anchorId="7183B03C">
-          <v:rect id="_x0000_i1519" style="width:0;height:1.5pt" o:hralign="center" o:hrstd="t" o:hr="t" fillcolor="#a0a0a0" stroked="f"/>
+          <v:rect id="_x0000_i1080" style="width:0;height:1.5pt" o:hralign="center" o:hrstd="t" o:hr="t" fillcolor="#a0a0a0" stroked="f"/>
         </w:pict>
       </w:r>
     </w:p>
@@ -12143,7 +12142,7 @@
     <w:p>
       <w:r>
         <w:pict w14:anchorId="640CF3EB">
-          <v:rect id="_x0000_i1520" style="width:0;height:1.5pt" o:hralign="center" o:hrstd="t" o:hr="t" fillcolor="#a0a0a0" stroked="f"/>
+          <v:rect id="_x0000_i1081" style="width:0;height:1.5pt" o:hralign="center" o:hrstd="t" o:hr="t" fillcolor="#a0a0a0" stroked="f"/>
         </w:pict>
       </w:r>
     </w:p>
@@ -12934,7 +12933,7 @@
     <w:p>
       <w:r>
         <w:pict w14:anchorId="5FF65D9A">
-          <v:rect id="_x0000_i1521" style="width:0;height:1.5pt" o:hralign="center" o:hrstd="t" o:hr="t" fillcolor="#a0a0a0" stroked="f"/>
+          <v:rect id="_x0000_i1082" style="width:0;height:1.5pt" o:hralign="center" o:hrstd="t" o:hr="t" fillcolor="#a0a0a0" stroked="f"/>
         </w:pict>
       </w:r>
     </w:p>
@@ -13546,7 +13545,7 @@
     <w:p>
       <w:r>
         <w:pict w14:anchorId="0971D7FB">
-          <v:rect id="_x0000_i1522" style="width:0;height:1.5pt" o:hralign="center" o:hrstd="t" o:hr="t" fillcolor="#a0a0a0" stroked="f"/>
+          <v:rect id="_x0000_i1083" style="width:0;height:1.5pt" o:hralign="center" o:hrstd="t" o:hr="t" fillcolor="#a0a0a0" stroked="f"/>
         </w:pict>
       </w:r>
     </w:p>
@@ -13947,7 +13946,7 @@
     <w:p>
       <w:r>
         <w:pict w14:anchorId="6F777566">
-          <v:rect id="_x0000_i1523" style="width:0;height:1.5pt" o:hralign="center" o:hrstd="t" o:hr="t" fillcolor="#a0a0a0" stroked="f"/>
+          <v:rect id="_x0000_i1084" style="width:0;height:1.5pt" o:hralign="center" o:hrstd="t" o:hr="t" fillcolor="#a0a0a0" stroked="f"/>
         </w:pict>
       </w:r>
     </w:p>
@@ -14005,7 +14004,7 @@
     <w:p>
       <w:r>
         <w:pict w14:anchorId="54DFB341">
-          <v:rect id="_x0000_i1524" style="width:0;height:1.5pt" o:hralign="center" o:hrstd="t" o:hr="t" fillcolor="#a0a0a0" stroked="f"/>
+          <v:rect id="_x0000_i1085" style="width:0;height:1.5pt" o:hralign="center" o:hrstd="t" o:hr="t" fillcolor="#a0a0a0" stroked="f"/>
         </w:pict>
       </w:r>
     </w:p>
@@ -14081,7 +14080,7 @@
     <w:p>
       <w:r>
         <w:pict w14:anchorId="24EC9F5A">
-          <v:rect id="_x0000_i1525" style="width:0;height:1.5pt" o:hralign="center" o:hrstd="t" o:hr="t" fillcolor="#a0a0a0" stroked="f"/>
+          <v:rect id="_x0000_i1086" style="width:0;height:1.5pt" o:hralign="center" o:hrstd="t" o:hr="t" fillcolor="#a0a0a0" stroked="f"/>
         </w:pict>
       </w:r>
     </w:p>
@@ -14125,41 +14124,229 @@
     </w:p>
     <w:p>
       <w:r>
-        <w:t>Review the full QEGPMO system and propose:</w:t>
+        <w:t>You are a senior enterprise solution architect.</w:t>
       </w:r>
     </w:p>
     <w:p/>
     <w:p>
       <w:r>
         <w:lastRenderedPageBreak/>
-        <w:t>- Performance optimizations</w:t>
-      </w:r>
-    </w:p>
-    <w:p>
-      <w:r>
-        <w:t>- Security hardening</w:t>
-      </w:r>
-    </w:p>
-    <w:p>
-      <w:r>
-        <w:t>- Scaling strategy</w:t>
-      </w:r>
-    </w:p>
-    <w:p>
-      <w:r>
-        <w:t>- Enterprise deployment architecture</w:t>
+        <w:t>This task is an ARCHITECTURE REVIEW AND HARDENING DOCUMENT,</w:t>
+      </w:r>
+    </w:p>
+    <w:p>
+      <w:r>
+        <w:t>not software development.</w:t>
       </w:r>
     </w:p>
     <w:p/>
     <w:p>
-      <w:r>
-        <w:t>Assume thousands of users and large portfolios.</w:t>
+      <w:proofErr w:type="gramStart"/>
+      <w:r>
+        <w:t>Review</w:t>
+      </w:r>
+      <w:proofErr w:type="gramEnd"/>
+      <w:r>
+        <w:t xml:space="preserve"> the complete QEGPMO system, including:</w:t>
+      </w:r>
+    </w:p>
+    <w:p>
+      <w:r>
+        <w:t>- Core backend services</w:t>
+      </w:r>
+    </w:p>
+    <w:p>
+      <w:r>
+        <w:t>- Workflow &amp; approval engine</w:t>
+      </w:r>
+    </w:p>
+    <w:p>
+      <w:r>
+        <w:t>- Scheduling, financials, resources, risks</w:t>
+      </w:r>
+    </w:p>
+    <w:p>
+      <w:r>
+        <w:t>- Executive dashboards</w:t>
+      </w:r>
+    </w:p>
+    <w:p>
+      <w:r>
+        <w:t>- AI-assisted services</w:t>
+      </w:r>
+    </w:p>
+    <w:p>
+      <w:r>
+        <w:t>- Integrations (Excel, MS Project)</w:t>
+      </w:r>
+    </w:p>
+    <w:p/>
+    <w:p>
+      <w:r>
+        <w:t>Assume:</w:t>
+      </w:r>
+    </w:p>
+    <w:p>
+      <w:r>
+        <w:t>- Thousands of concurrent users</w:t>
+      </w:r>
+    </w:p>
+    <w:p>
+      <w:r>
+        <w:t>- Large portfolios with hundreds to thousands of projects</w:t>
+      </w:r>
+    </w:p>
+    <w:p>
+      <w:r>
+        <w:t>- Enterprise governance and compliance requirements</w:t>
+      </w:r>
+    </w:p>
+    <w:p/>
+    <w:p>
+      <w:r>
+        <w:t>PROPOSE AND DOCUMENT:</w:t>
+      </w:r>
+    </w:p>
+    <w:p/>
+    <w:p>
+      <w:r>
+        <w:t>1. Performance Optimizations</w:t>
+      </w:r>
+    </w:p>
+    <w:p>
+      <w:r>
+        <w:t>   - Backend API performance</w:t>
+      </w:r>
+    </w:p>
+    <w:p>
+      <w:r>
+        <w:t>   - Roll-up and aggregation performance</w:t>
+      </w:r>
+    </w:p>
+    <w:p>
+      <w:r>
+        <w:t>   - Dashboard responsiveness</w:t>
+      </w:r>
+    </w:p>
+    <w:p>
+      <w:r>
+        <w:t>   - AI processing efficiency</w:t>
+      </w:r>
+    </w:p>
+    <w:p/>
+    <w:p>
+      <w:r>
+        <w:t>2. Security Hardening</w:t>
+      </w:r>
+    </w:p>
+    <w:p>
+      <w:r>
+        <w:t>   - Authentication &amp; authorization</w:t>
+      </w:r>
+    </w:p>
+    <w:p>
+      <w:r>
+        <w:lastRenderedPageBreak/>
+        <w:t>   - RBAC enforcement</w:t>
+      </w:r>
+    </w:p>
+    <w:p>
+      <w:r>
+        <w:t>   - Data isolation and tenant security</w:t>
+      </w:r>
+    </w:p>
+    <w:p>
+      <w:r>
+        <w:t>   - Audit and compliance readiness</w:t>
+      </w:r>
+    </w:p>
+    <w:p/>
+    <w:p>
+      <w:r>
+        <w:t>3. Scaling Strategy</w:t>
+      </w:r>
+    </w:p>
+    <w:p>
+      <w:r>
+        <w:t>   - Horizontal and vertical scaling</w:t>
+      </w:r>
+    </w:p>
+    <w:p>
+      <w:r>
+        <w:t>   - Database scaling considerations</w:t>
+      </w:r>
+    </w:p>
+    <w:p>
+      <w:r>
+        <w:t>   - AI service scaling</w:t>
+      </w:r>
+    </w:p>
+    <w:p>
+      <w:r>
+        <w:t>   - Background job and scheduler scaling</w:t>
+      </w:r>
+    </w:p>
+    <w:p/>
+    <w:p>
+      <w:r>
+        <w:t>4. Enterprise Deployment Architecture</w:t>
+      </w:r>
+    </w:p>
+    <w:p>
+      <w:r>
+        <w:t>   - Recommended production architecture</w:t>
+      </w:r>
+    </w:p>
+    <w:p>
+      <w:r>
+        <w:t>   - Environment separation (dev, test, prod)</w:t>
+      </w:r>
+    </w:p>
+    <w:p>
+      <w:r>
+        <w:t>   - High availability and disaster recovery</w:t>
+      </w:r>
+    </w:p>
+    <w:p>
+      <w:r>
+        <w:t>   - Monitoring and observability</w:t>
+      </w:r>
+    </w:p>
+    <w:p/>
+    <w:p>
+      <w:r>
+        <w:t>OUTPUT REQUIREMENTS:</w:t>
+      </w:r>
+    </w:p>
+    <w:p>
+      <w:r>
+        <w:t>- Produce a clear, structured architecture review document</w:t>
+      </w:r>
+    </w:p>
+    <w:p>
+      <w:r>
+        <w:t>- Use sections, headings, and bullet points</w:t>
+      </w:r>
+    </w:p>
+    <w:p>
+      <w:r>
+        <w:t>- No source code</w:t>
+      </w:r>
+    </w:p>
+    <w:p>
+      <w:r>
+        <w:t>- No executable output</w:t>
+      </w:r>
+    </w:p>
+    <w:p>
+      <w:r>
+        <w:t>- This document will be used as final pre-production guidance</w:t>
       </w:r>
     </w:p>
     <w:p>
       <w:r>
         <w:pict w14:anchorId="24AA1843">
-          <v:rect id="_x0000_i1526" style="width:0;height:1.5pt" o:hralign="center" o:hrstd="t" o:hr="t" fillcolor="#a0a0a0" stroked="f"/>
+          <v:rect id="_x0000_i1087" style="width:0;height:1.5pt" o:hralign="center" o:hrstd="t" o:hr="t" fillcolor="#a0a0a0" stroked="f"/>
         </w:pict>
       </w:r>
     </w:p>
@@ -14257,8 +14444,9 @@
     </w:p>
     <w:p>
       <w:r>
+        <w:lastRenderedPageBreak/>
         <w:pict w14:anchorId="2C7190A4">
-          <v:rect id="_x0000_i1527" style="width:0;height:1.5pt" o:hralign="center" o:hrstd="t" o:hr="t" fillcolor="#a0a0a0" stroked="f"/>
+          <v:rect id="_x0000_i1088" style="width:0;height:1.5pt" o:hralign="center" o:hrstd="t" o:hr="t" fillcolor="#a0a0a0" stroked="f"/>
         </w:pict>
       </w:r>
     </w:p>

</xml_diff>